<commit_message>
Mejora de formato y correccion de tablas
</commit_message>
<xml_diff>
--- a/plantilla/plantilla_base_final.docx
+++ b/plantilla/plantilla_base_final.docx
@@ -28898,19 +28898,7 @@
                 <w:szCs w:val="18"/>
                 <w:lang w:val="es-419" w:eastAsia="es-419"/>
               </w:rPr>
-              <w:t>T</w:t>
-            </w:r>
-            <w:r>
-              <w:rPr>
-                <w:rFonts w:ascii="Trebuchet MS" w:eastAsia="Times New Roman" w:hAnsi="Trebuchet MS" w:cs="Times New Roman"/>
-                <w:b/>
-                <w:bCs/>
-                <w:color w:val="000000"/>
-                <w:sz w:val="18"/>
-                <w:szCs w:val="18"/>
-                <w:lang w:val="es-419" w:eastAsia="es-419"/>
-              </w:rPr>
-              <w:t>otal</w:t>
+              <w:t>Total</w:t>
             </w:r>
             <w:proofErr w:type="gramEnd"/>
             <w:r>
@@ -36494,6 +36482,2112 @@
         </w:tc>
       </w:tr>
     </w:tbl>
+    <w:p>
+      <w:pPr>
+        <w:spacing w:after="160" w:line="259" w:lineRule="auto"/>
+      </w:pPr>
+    </w:p>
+    <w:tbl>
+      <w:tblPr>
+        <w:tblW w:w="8789" w:type="dxa"/>
+        <w:tblCellMar>
+          <w:left w:w="70" w:type="dxa"/>
+          <w:right w:w="70" w:type="dxa"/>
+        </w:tblCellMar>
+        <w:tblLook w:val="04A0" w:firstRow="1" w:lastRow="0" w:firstColumn="1" w:lastColumn="0" w:noHBand="0" w:noVBand="1"/>
+      </w:tblPr>
+      <w:tblGrid>
+        <w:gridCol w:w="1843"/>
+        <w:gridCol w:w="1189"/>
+        <w:gridCol w:w="1189"/>
+        <w:gridCol w:w="1296"/>
+        <w:gridCol w:w="1296"/>
+        <w:gridCol w:w="1976"/>
+      </w:tblGrid>
+      <w:tr>
+        <w:trPr>
+          <w:trHeight w:val="240"/>
+        </w:trPr>
+        <w:tc>
+          <w:tcPr>
+            <w:tcW w:w="1843" w:type="dxa"/>
+            <w:tcBorders>
+              <w:top w:val="nil"/>
+              <w:left w:val="nil"/>
+              <w:bottom w:val="nil"/>
+              <w:right w:val="nil"/>
+            </w:tcBorders>
+            <w:noWrap/>
+            <w:vAlign w:val="center"/>
+          </w:tcPr>
+          <w:p>
+            <w:pPr>
+              <w:spacing w:after="0" w:line="240" w:lineRule="auto"/>
+              <w:rPr>
+                <w:rFonts w:ascii="Times New Roman" w:eastAsia="Times New Roman" w:hAnsi="Times New Roman" w:cs="Times New Roman"/>
+                <w:sz w:val="16"/>
+                <w:szCs w:val="16"/>
+                <w:lang w:val="es-419" w:eastAsia="es-419"/>
+              </w:rPr>
+            </w:pPr>
+            <w:r>
+              <w:rPr>
+                <w:rFonts w:ascii="Trebuchet MS" w:eastAsia="Times New Roman" w:hAnsi="Trebuchet MS" w:cs="Times New Roman"/>
+                <w:b/>
+                <w:bCs/>
+                <w:color w:val="000000"/>
+                <w:sz w:val="16"/>
+                <w:szCs w:val="16"/>
+                <w:lang w:val="es-419" w:eastAsia="es-419"/>
+              </w:rPr>
+              <w:t>[[MODELO_</w:t>
+            </w:r>
+            <w:r>
+              <w:rPr>
+                <w:rFonts w:ascii="Trebuchet MS" w:eastAsia="Times New Roman" w:hAnsi="Trebuchet MS" w:cs="Times New Roman"/>
+                <w:b/>
+                <w:bCs/>
+                <w:color w:val="000000"/>
+                <w:sz w:val="16"/>
+                <w:szCs w:val="16"/>
+                <w:lang w:val="es-419" w:eastAsia="es-419"/>
+              </w:rPr>
+              <w:t>DERIVA</w:t>
+            </w:r>
+            <w:r>
+              <w:rPr>
+                <w:rFonts w:ascii="Trebuchet MS" w:eastAsia="Times New Roman" w:hAnsi="Trebuchet MS" w:cs="Times New Roman"/>
+                <w:b/>
+                <w:bCs/>
+                <w:color w:val="000000"/>
+                <w:sz w:val="16"/>
+                <w:szCs w:val="16"/>
+                <w:lang w:val="es-419" w:eastAsia="es-419"/>
+              </w:rPr>
+              <w:t>]]</w:t>
+            </w:r>
+          </w:p>
+        </w:tc>
+        <w:tc>
+          <w:tcPr>
+            <w:tcW w:w="1189" w:type="dxa"/>
+            <w:tcBorders>
+              <w:top w:val="nil"/>
+              <w:left w:val="nil"/>
+              <w:bottom w:val="nil"/>
+              <w:right w:val="nil"/>
+            </w:tcBorders>
+            <w:noWrap/>
+            <w:vAlign w:val="center"/>
+          </w:tcPr>
+          <w:p>
+            <w:pPr>
+              <w:spacing w:after="0" w:line="240" w:lineRule="auto"/>
+              <w:rPr>
+                <w:rFonts w:ascii="Times New Roman" w:eastAsia="Times New Roman" w:hAnsi="Times New Roman" w:cs="Times New Roman"/>
+                <w:sz w:val="16"/>
+                <w:szCs w:val="16"/>
+                <w:lang w:val="es-419" w:eastAsia="es-419"/>
+              </w:rPr>
+            </w:pPr>
+          </w:p>
+        </w:tc>
+        <w:tc>
+          <w:tcPr>
+            <w:tcW w:w="1189" w:type="dxa"/>
+            <w:tcBorders>
+              <w:top w:val="nil"/>
+              <w:left w:val="nil"/>
+              <w:bottom w:val="nil"/>
+              <w:right w:val="nil"/>
+            </w:tcBorders>
+            <w:noWrap/>
+            <w:vAlign w:val="center"/>
+          </w:tcPr>
+          <w:p>
+            <w:pPr>
+              <w:spacing w:after="0" w:line="240" w:lineRule="auto"/>
+              <w:rPr>
+                <w:rFonts w:ascii="Times New Roman" w:eastAsia="Times New Roman" w:hAnsi="Times New Roman" w:cs="Times New Roman"/>
+                <w:sz w:val="16"/>
+                <w:szCs w:val="16"/>
+                <w:lang w:val="es-419" w:eastAsia="es-419"/>
+              </w:rPr>
+            </w:pPr>
+          </w:p>
+        </w:tc>
+        <w:tc>
+          <w:tcPr>
+            <w:tcW w:w="1296" w:type="dxa"/>
+            <w:tcBorders>
+              <w:top w:val="nil"/>
+              <w:left w:val="nil"/>
+              <w:bottom w:val="nil"/>
+              <w:right w:val="nil"/>
+            </w:tcBorders>
+            <w:noWrap/>
+            <w:vAlign w:val="center"/>
+          </w:tcPr>
+          <w:p>
+            <w:pPr>
+              <w:spacing w:after="0" w:line="240" w:lineRule="auto"/>
+              <w:rPr>
+                <w:rFonts w:ascii="Times New Roman" w:eastAsia="Times New Roman" w:hAnsi="Times New Roman" w:cs="Times New Roman"/>
+                <w:sz w:val="16"/>
+                <w:szCs w:val="16"/>
+                <w:lang w:val="es-419" w:eastAsia="es-419"/>
+              </w:rPr>
+            </w:pPr>
+          </w:p>
+        </w:tc>
+        <w:tc>
+          <w:tcPr>
+            <w:tcW w:w="1296" w:type="dxa"/>
+            <w:tcBorders>
+              <w:top w:val="nil"/>
+              <w:left w:val="nil"/>
+              <w:bottom w:val="nil"/>
+              <w:right w:val="nil"/>
+            </w:tcBorders>
+            <w:noWrap/>
+            <w:vAlign w:val="bottom"/>
+          </w:tcPr>
+          <w:p>
+            <w:pPr>
+              <w:spacing w:after="0" w:line="240" w:lineRule="auto"/>
+              <w:rPr>
+                <w:rFonts w:ascii="Times New Roman" w:eastAsia="Times New Roman" w:hAnsi="Times New Roman" w:cs="Times New Roman"/>
+                <w:sz w:val="16"/>
+                <w:szCs w:val="16"/>
+                <w:lang w:val="es-419" w:eastAsia="es-419"/>
+              </w:rPr>
+            </w:pPr>
+          </w:p>
+        </w:tc>
+        <w:tc>
+          <w:tcPr>
+            <w:tcW w:w="1976" w:type="dxa"/>
+            <w:tcBorders>
+              <w:top w:val="nil"/>
+              <w:left w:val="nil"/>
+              <w:bottom w:val="nil"/>
+              <w:right w:val="nil"/>
+            </w:tcBorders>
+            <w:noWrap/>
+            <w:vAlign w:val="bottom"/>
+          </w:tcPr>
+          <w:p>
+            <w:pPr>
+              <w:spacing w:after="0" w:line="240" w:lineRule="auto"/>
+              <w:rPr>
+                <w:rFonts w:ascii="Times New Roman" w:eastAsia="Times New Roman" w:hAnsi="Times New Roman" w:cs="Times New Roman"/>
+                <w:sz w:val="16"/>
+                <w:szCs w:val="16"/>
+                <w:lang w:val="es-419" w:eastAsia="es-419"/>
+              </w:rPr>
+            </w:pPr>
+          </w:p>
+        </w:tc>
+      </w:tr>
+      <w:tr>
+        <w:trPr>
+          <w:trHeight w:val="240"/>
+        </w:trPr>
+        <w:tc>
+          <w:tcPr>
+            <w:tcW w:w="1843" w:type="dxa"/>
+            <w:tcBorders>
+              <w:top w:val="nil"/>
+              <w:left w:val="nil"/>
+              <w:bottom w:val="nil"/>
+              <w:right w:val="nil"/>
+            </w:tcBorders>
+            <w:noWrap/>
+            <w:vAlign w:val="center"/>
+            <w:hideMark/>
+          </w:tcPr>
+          <w:p>
+            <w:pPr>
+              <w:spacing w:after="0" w:line="240" w:lineRule="auto"/>
+              <w:rPr>
+                <w:rFonts w:ascii="Times New Roman" w:eastAsia="Times New Roman" w:hAnsi="Times New Roman" w:cs="Times New Roman"/>
+                <w:sz w:val="16"/>
+                <w:szCs w:val="16"/>
+                <w:lang w:val="es-419" w:eastAsia="es-419"/>
+              </w:rPr>
+            </w:pPr>
+          </w:p>
+        </w:tc>
+        <w:tc>
+          <w:tcPr>
+            <w:tcW w:w="1189" w:type="dxa"/>
+            <w:tcBorders>
+              <w:top w:val="nil"/>
+              <w:left w:val="nil"/>
+              <w:bottom w:val="nil"/>
+              <w:right w:val="nil"/>
+            </w:tcBorders>
+            <w:noWrap/>
+            <w:vAlign w:val="center"/>
+            <w:hideMark/>
+          </w:tcPr>
+          <w:p>
+            <w:pPr>
+              <w:spacing w:after="0" w:line="240" w:lineRule="auto"/>
+              <w:rPr>
+                <w:rFonts w:ascii="Trebuchet MS" w:eastAsia="Times New Roman" w:hAnsi="Trebuchet MS" w:cs="Times New Roman"/>
+                <w:b/>
+                <w:bCs/>
+                <w:color w:val="000000"/>
+                <w:sz w:val="16"/>
+                <w:szCs w:val="16"/>
+                <w:lang w:val="es-419" w:eastAsia="es-419"/>
+              </w:rPr>
+            </w:pPr>
+            <w:r>
+              <w:rPr>
+                <w:rFonts w:ascii="Trebuchet MS" w:eastAsia="Times New Roman" w:hAnsi="Trebuchet MS" w:cs="Times New Roman"/>
+                <w:b/>
+                <w:bCs/>
+                <w:color w:val="000000"/>
+                <w:sz w:val="16"/>
+                <w:szCs w:val="16"/>
+                <w:lang w:val="es-419" w:eastAsia="es-419"/>
+              </w:rPr>
+              <w:t>Fechas de</w:t>
+            </w:r>
+          </w:p>
+        </w:tc>
+        <w:tc>
+          <w:tcPr>
+            <w:tcW w:w="1189" w:type="dxa"/>
+            <w:tcBorders>
+              <w:top w:val="nil"/>
+              <w:left w:val="nil"/>
+              <w:bottom w:val="nil"/>
+              <w:right w:val="nil"/>
+            </w:tcBorders>
+            <w:noWrap/>
+            <w:vAlign w:val="bottom"/>
+            <w:hideMark/>
+          </w:tcPr>
+          <w:p>
+            <w:pPr>
+              <w:spacing w:after="0" w:line="240" w:lineRule="auto"/>
+              <w:rPr>
+                <w:rFonts w:ascii="Trebuchet MS" w:eastAsia="Times New Roman" w:hAnsi="Trebuchet MS" w:cs="Times New Roman"/>
+                <w:b/>
+                <w:bCs/>
+                <w:color w:val="000000"/>
+                <w:sz w:val="16"/>
+                <w:szCs w:val="16"/>
+                <w:lang w:val="es-419" w:eastAsia="es-419"/>
+              </w:rPr>
+            </w:pPr>
+          </w:p>
+        </w:tc>
+        <w:tc>
+          <w:tcPr>
+            <w:tcW w:w="2592" w:type="dxa"/>
+            <w:gridSpan w:val="2"/>
+            <w:tcBorders>
+              <w:top w:val="nil"/>
+              <w:left w:val="nil"/>
+              <w:bottom w:val="nil"/>
+              <w:right w:val="nil"/>
+            </w:tcBorders>
+            <w:noWrap/>
+            <w:vAlign w:val="center"/>
+            <w:hideMark/>
+          </w:tcPr>
+          <w:p>
+            <w:pPr>
+              <w:spacing w:after="0" w:line="240" w:lineRule="auto"/>
+              <w:rPr>
+                <w:rFonts w:ascii="Trebuchet MS" w:eastAsia="Times New Roman" w:hAnsi="Trebuchet MS" w:cs="Times New Roman"/>
+                <w:b/>
+                <w:bCs/>
+                <w:color w:val="000000"/>
+                <w:sz w:val="16"/>
+                <w:szCs w:val="16"/>
+                <w:lang w:val="es-419" w:eastAsia="es-419"/>
+              </w:rPr>
+            </w:pPr>
+            <w:r>
+              <w:rPr>
+                <w:rFonts w:ascii="Trebuchet MS" w:eastAsia="Times New Roman" w:hAnsi="Trebuchet MS" w:cs="Times New Roman"/>
+                <w:b/>
+                <w:bCs/>
+                <w:color w:val="000000"/>
+                <w:sz w:val="16"/>
+                <w:szCs w:val="16"/>
+                <w:lang w:val="es-419" w:eastAsia="es-419"/>
+              </w:rPr>
+              <w:t>Tasa de interés</w:t>
+            </w:r>
+          </w:p>
+        </w:tc>
+        <w:tc>
+          <w:tcPr>
+            <w:tcW w:w="1976" w:type="dxa"/>
+            <w:tcBorders>
+              <w:top w:val="nil"/>
+              <w:left w:val="nil"/>
+              <w:bottom w:val="nil"/>
+              <w:right w:val="nil"/>
+            </w:tcBorders>
+            <w:noWrap/>
+            <w:vAlign w:val="center"/>
+            <w:hideMark/>
+          </w:tcPr>
+          <w:p>
+            <w:pPr>
+              <w:spacing w:after="0" w:line="240" w:lineRule="auto"/>
+              <w:jc w:val="center"/>
+              <w:rPr>
+                <w:rFonts w:ascii="Trebuchet MS" w:eastAsia="Times New Roman" w:hAnsi="Trebuchet MS" w:cs="Times New Roman"/>
+                <w:b/>
+                <w:bCs/>
+                <w:color w:val="000000"/>
+                <w:sz w:val="16"/>
+                <w:szCs w:val="16"/>
+                <w:lang w:val="es-419" w:eastAsia="es-419"/>
+              </w:rPr>
+            </w:pPr>
+            <w:r>
+              <w:rPr>
+                <w:rFonts w:ascii="Trebuchet MS" w:eastAsia="Times New Roman" w:hAnsi="Trebuchet MS" w:cs="Times New Roman"/>
+                <w:b/>
+                <w:bCs/>
+                <w:color w:val="000000"/>
+                <w:sz w:val="16"/>
+                <w:szCs w:val="16"/>
+                <w:lang w:val="es-419" w:eastAsia="es-419"/>
+              </w:rPr>
+              <w:t xml:space="preserve">Valor razonable </w:t>
+            </w:r>
+          </w:p>
+        </w:tc>
+      </w:tr>
+      <w:tr>
+        <w:trPr>
+          <w:trHeight w:val="390"/>
+        </w:trPr>
+        <w:tc>
+          <w:tcPr>
+            <w:tcW w:w="1843" w:type="dxa"/>
+            <w:tcBorders>
+              <w:top w:val="nil"/>
+              <w:left w:val="nil"/>
+              <w:bottom w:val="nil"/>
+              <w:right w:val="nil"/>
+            </w:tcBorders>
+            <w:vAlign w:val="center"/>
+            <w:hideMark/>
+          </w:tcPr>
+          <w:p>
+            <w:pPr>
+              <w:spacing w:after="0" w:line="240" w:lineRule="auto"/>
+              <w:jc w:val="center"/>
+              <w:rPr>
+                <w:rFonts w:ascii="Trebuchet MS" w:eastAsia="Times New Roman" w:hAnsi="Trebuchet MS" w:cs="Times New Roman"/>
+                <w:b/>
+                <w:bCs/>
+                <w:color w:val="000000"/>
+                <w:sz w:val="16"/>
+                <w:szCs w:val="16"/>
+                <w:lang w:val="es-419" w:eastAsia="es-419"/>
+              </w:rPr>
+            </w:pPr>
+            <w:r>
+              <w:rPr>
+                <w:rFonts w:ascii="Trebuchet MS" w:eastAsia="Times New Roman" w:hAnsi="Trebuchet MS" w:cs="Times New Roman"/>
+                <w:b/>
+                <w:bCs/>
+                <w:color w:val="000000"/>
+                <w:sz w:val="16"/>
+                <w:szCs w:val="16"/>
+                <w:lang w:val="es-419" w:eastAsia="es-419"/>
+              </w:rPr>
+              <w:t>Monto nocional</w:t>
+            </w:r>
+          </w:p>
+        </w:tc>
+        <w:tc>
+          <w:tcPr>
+            <w:tcW w:w="1189" w:type="dxa"/>
+            <w:tcBorders>
+              <w:top w:val="nil"/>
+              <w:left w:val="nil"/>
+              <w:bottom w:val="nil"/>
+              <w:right w:val="nil"/>
+            </w:tcBorders>
+            <w:noWrap/>
+            <w:vAlign w:val="center"/>
+            <w:hideMark/>
+          </w:tcPr>
+          <w:p>
+            <w:pPr>
+              <w:spacing w:after="0" w:line="240" w:lineRule="auto"/>
+              <w:jc w:val="center"/>
+              <w:rPr>
+                <w:rFonts w:ascii="Trebuchet MS" w:eastAsia="Times New Roman" w:hAnsi="Trebuchet MS" w:cs="Times New Roman"/>
+                <w:b/>
+                <w:bCs/>
+                <w:color w:val="000000"/>
+                <w:sz w:val="16"/>
+                <w:szCs w:val="16"/>
+                <w:lang w:val="es-419" w:eastAsia="es-419"/>
+              </w:rPr>
+            </w:pPr>
+            <w:r>
+              <w:rPr>
+                <w:rFonts w:ascii="Trebuchet MS" w:eastAsia="Times New Roman" w:hAnsi="Trebuchet MS" w:cs="Times New Roman"/>
+                <w:b/>
+                <w:bCs/>
+                <w:color w:val="000000"/>
+                <w:sz w:val="16"/>
+                <w:szCs w:val="16"/>
+                <w:lang w:val="es-419" w:eastAsia="es-419"/>
+              </w:rPr>
+              <w:t>Contratación</w:t>
+            </w:r>
+          </w:p>
+        </w:tc>
+        <w:tc>
+          <w:tcPr>
+            <w:tcW w:w="1189" w:type="dxa"/>
+            <w:tcBorders>
+              <w:top w:val="nil"/>
+              <w:left w:val="nil"/>
+              <w:bottom w:val="nil"/>
+              <w:right w:val="nil"/>
+            </w:tcBorders>
+            <w:noWrap/>
+            <w:vAlign w:val="center"/>
+            <w:hideMark/>
+          </w:tcPr>
+          <w:p>
+            <w:pPr>
+              <w:spacing w:after="0" w:line="240" w:lineRule="auto"/>
+              <w:jc w:val="center"/>
+              <w:rPr>
+                <w:rFonts w:ascii="Trebuchet MS" w:eastAsia="Times New Roman" w:hAnsi="Trebuchet MS" w:cs="Times New Roman"/>
+                <w:b/>
+                <w:bCs/>
+                <w:color w:val="000000"/>
+                <w:sz w:val="16"/>
+                <w:szCs w:val="16"/>
+                <w:lang w:val="es-419" w:eastAsia="es-419"/>
+              </w:rPr>
+            </w:pPr>
+            <w:r>
+              <w:rPr>
+                <w:rFonts w:ascii="Trebuchet MS" w:eastAsia="Times New Roman" w:hAnsi="Trebuchet MS" w:cs="Times New Roman"/>
+                <w:b/>
+                <w:bCs/>
+                <w:color w:val="000000"/>
+                <w:sz w:val="16"/>
+                <w:szCs w:val="16"/>
+                <w:lang w:val="es-419" w:eastAsia="es-419"/>
+              </w:rPr>
+              <w:t>Vencimiento</w:t>
+            </w:r>
+          </w:p>
+        </w:tc>
+        <w:tc>
+          <w:tcPr>
+            <w:tcW w:w="1296" w:type="dxa"/>
+            <w:tcBorders>
+              <w:top w:val="nil"/>
+              <w:left w:val="nil"/>
+              <w:bottom w:val="nil"/>
+              <w:right w:val="nil"/>
+            </w:tcBorders>
+            <w:vAlign w:val="center"/>
+            <w:hideMark/>
+          </w:tcPr>
+          <w:p>
+            <w:pPr>
+              <w:spacing w:after="0" w:line="240" w:lineRule="auto"/>
+              <w:jc w:val="center"/>
+              <w:rPr>
+                <w:rFonts w:ascii="Trebuchet MS" w:eastAsia="Times New Roman" w:hAnsi="Trebuchet MS" w:cs="Times New Roman"/>
+                <w:b/>
+                <w:bCs/>
+                <w:color w:val="000000"/>
+                <w:sz w:val="16"/>
+                <w:szCs w:val="16"/>
+                <w:lang w:val="es-419" w:eastAsia="es-419"/>
+              </w:rPr>
+            </w:pPr>
+            <w:r>
+              <w:rPr>
+                <w:rFonts w:ascii="Trebuchet MS" w:eastAsia="Times New Roman" w:hAnsi="Trebuchet MS" w:cs="Times New Roman"/>
+                <w:b/>
+                <w:bCs/>
+                <w:color w:val="000000"/>
+                <w:sz w:val="16"/>
+                <w:szCs w:val="16"/>
+                <w:lang w:val="es-419" w:eastAsia="es-419"/>
+              </w:rPr>
+              <w:t>Contratada por IFD</w:t>
+            </w:r>
+          </w:p>
+        </w:tc>
+        <w:tc>
+          <w:tcPr>
+            <w:tcW w:w="1296" w:type="dxa"/>
+            <w:tcBorders>
+              <w:top w:val="nil"/>
+              <w:left w:val="nil"/>
+              <w:bottom w:val="nil"/>
+              <w:right w:val="nil"/>
+            </w:tcBorders>
+            <w:vAlign w:val="center"/>
+            <w:hideMark/>
+          </w:tcPr>
+          <w:p>
+            <w:pPr>
+              <w:spacing w:after="0" w:line="240" w:lineRule="auto"/>
+              <w:jc w:val="center"/>
+              <w:rPr>
+                <w:rFonts w:ascii="Trebuchet MS" w:eastAsia="Times New Roman" w:hAnsi="Trebuchet MS" w:cs="Times New Roman"/>
+                <w:b/>
+                <w:bCs/>
+                <w:color w:val="000000"/>
+                <w:sz w:val="16"/>
+                <w:szCs w:val="16"/>
+                <w:lang w:val="es-419" w:eastAsia="es-419"/>
+              </w:rPr>
+            </w:pPr>
+            <w:r>
+              <w:rPr>
+                <w:rFonts w:ascii="Trebuchet MS" w:eastAsia="Times New Roman" w:hAnsi="Trebuchet MS" w:cs="Times New Roman"/>
+                <w:b/>
+                <w:bCs/>
+                <w:color w:val="000000"/>
+                <w:sz w:val="16"/>
+                <w:szCs w:val="16"/>
+                <w:lang w:val="es-419" w:eastAsia="es-419"/>
+              </w:rPr>
+              <w:t>Pactado en deuda</w:t>
+            </w:r>
+          </w:p>
+        </w:tc>
+        <w:tc>
+          <w:tcPr>
+            <w:tcW w:w="1976" w:type="dxa"/>
+            <w:tcBorders>
+              <w:top w:val="nil"/>
+              <w:left w:val="nil"/>
+              <w:bottom w:val="nil"/>
+              <w:right w:val="nil"/>
+            </w:tcBorders>
+            <w:vAlign w:val="center"/>
+            <w:hideMark/>
+          </w:tcPr>
+          <w:p>
+            <w:pPr>
+              <w:spacing w:after="0" w:line="240" w:lineRule="auto"/>
+              <w:jc w:val="center"/>
+              <w:rPr>
+                <w:rFonts w:ascii="Trebuchet MS" w:eastAsia="Times New Roman" w:hAnsi="Trebuchet MS" w:cs="Times New Roman"/>
+                <w:b/>
+                <w:bCs/>
+                <w:color w:val="000000"/>
+                <w:sz w:val="16"/>
+                <w:szCs w:val="16"/>
+                <w:lang w:val="es-419" w:eastAsia="es-419"/>
+              </w:rPr>
+            </w:pPr>
+            <w:r>
+              <w:rPr>
+                <w:rFonts w:ascii="Trebuchet MS" w:eastAsia="Times New Roman" w:hAnsi="Trebuchet MS" w:cs="Times New Roman"/>
+                <w:b/>
+                <w:bCs/>
+                <w:color w:val="000000"/>
+                <w:sz w:val="16"/>
+                <w:szCs w:val="16"/>
+                <w:lang w:val="es-419" w:eastAsia="es-419"/>
+              </w:rPr>
+              <w:t xml:space="preserve">al 30 de septiembre de: </w:t>
+            </w:r>
+            <w:r>
+              <w:rPr>
+                <w:rFonts w:ascii="Trebuchet MS" w:eastAsia="Times New Roman" w:hAnsi="Trebuchet MS" w:cs="Times New Roman"/>
+                <w:b/>
+                <w:bCs/>
+                <w:color w:val="000000"/>
+                <w:sz w:val="16"/>
+                <w:szCs w:val="16"/>
+                <w:lang w:val="es-419" w:eastAsia="es-419"/>
+              </w:rPr>
+              <w:br/>
+              <w:t>2025</w:t>
+            </w:r>
+          </w:p>
+        </w:tc>
+      </w:tr>
+      <w:tr>
+        <w:trPr>
+          <w:trHeight w:val="240"/>
+        </w:trPr>
+        <w:tc>
+          <w:tcPr>
+            <w:tcW w:w="1843" w:type="dxa"/>
+            <w:tcBorders>
+              <w:top w:val="nil"/>
+              <w:left w:val="nil"/>
+              <w:bottom w:val="nil"/>
+              <w:right w:val="nil"/>
+            </w:tcBorders>
+            <w:noWrap/>
+            <w:vAlign w:val="bottom"/>
+            <w:hideMark/>
+          </w:tcPr>
+          <w:p>
+            <w:pPr>
+              <w:spacing w:after="0" w:line="240" w:lineRule="auto"/>
+              <w:jc w:val="center"/>
+              <w:rPr>
+                <w:rFonts w:ascii="Trebuchet MS" w:eastAsia="Times New Roman" w:hAnsi="Trebuchet MS" w:cs="Times New Roman"/>
+                <w:b/>
+                <w:bCs/>
+                <w:color w:val="000000"/>
+                <w:sz w:val="16"/>
+                <w:szCs w:val="16"/>
+                <w:lang w:val="es-419" w:eastAsia="es-419"/>
+              </w:rPr>
+            </w:pPr>
+          </w:p>
+        </w:tc>
+        <w:tc>
+          <w:tcPr>
+            <w:tcW w:w="1189" w:type="dxa"/>
+            <w:tcBorders>
+              <w:top w:val="nil"/>
+              <w:left w:val="nil"/>
+              <w:bottom w:val="nil"/>
+              <w:right w:val="nil"/>
+            </w:tcBorders>
+            <w:noWrap/>
+            <w:vAlign w:val="center"/>
+            <w:hideMark/>
+          </w:tcPr>
+          <w:p>
+            <w:pPr>
+              <w:spacing w:after="0" w:line="240" w:lineRule="auto"/>
+              <w:rPr>
+                <w:rFonts w:ascii="Times New Roman" w:eastAsia="Times New Roman" w:hAnsi="Times New Roman" w:cs="Times New Roman"/>
+                <w:sz w:val="20"/>
+                <w:szCs w:val="20"/>
+                <w:lang w:val="es-419" w:eastAsia="es-419"/>
+              </w:rPr>
+            </w:pPr>
+          </w:p>
+        </w:tc>
+        <w:tc>
+          <w:tcPr>
+            <w:tcW w:w="1189" w:type="dxa"/>
+            <w:tcBorders>
+              <w:top w:val="nil"/>
+              <w:left w:val="nil"/>
+              <w:bottom w:val="nil"/>
+              <w:right w:val="nil"/>
+            </w:tcBorders>
+            <w:noWrap/>
+            <w:vAlign w:val="center"/>
+            <w:hideMark/>
+          </w:tcPr>
+          <w:p>
+            <w:pPr>
+              <w:spacing w:after="0" w:line="240" w:lineRule="auto"/>
+              <w:rPr>
+                <w:rFonts w:ascii="Times New Roman" w:eastAsia="Times New Roman" w:hAnsi="Times New Roman" w:cs="Times New Roman"/>
+                <w:sz w:val="20"/>
+                <w:szCs w:val="20"/>
+                <w:lang w:val="es-419" w:eastAsia="es-419"/>
+              </w:rPr>
+            </w:pPr>
+          </w:p>
+        </w:tc>
+        <w:tc>
+          <w:tcPr>
+            <w:tcW w:w="1296" w:type="dxa"/>
+            <w:tcBorders>
+              <w:top w:val="nil"/>
+              <w:left w:val="nil"/>
+              <w:bottom w:val="nil"/>
+              <w:right w:val="nil"/>
+            </w:tcBorders>
+            <w:noWrap/>
+            <w:vAlign w:val="center"/>
+            <w:hideMark/>
+          </w:tcPr>
+          <w:p>
+            <w:pPr>
+              <w:spacing w:after="0" w:line="240" w:lineRule="auto"/>
+              <w:rPr>
+                <w:rFonts w:ascii="Times New Roman" w:eastAsia="Times New Roman" w:hAnsi="Times New Roman" w:cs="Times New Roman"/>
+                <w:sz w:val="20"/>
+                <w:szCs w:val="20"/>
+                <w:lang w:val="es-419" w:eastAsia="es-419"/>
+              </w:rPr>
+            </w:pPr>
+          </w:p>
+        </w:tc>
+        <w:tc>
+          <w:tcPr>
+            <w:tcW w:w="1296" w:type="dxa"/>
+            <w:tcBorders>
+              <w:top w:val="nil"/>
+              <w:left w:val="nil"/>
+              <w:bottom w:val="nil"/>
+              <w:right w:val="nil"/>
+            </w:tcBorders>
+            <w:noWrap/>
+            <w:vAlign w:val="center"/>
+            <w:hideMark/>
+          </w:tcPr>
+          <w:p>
+            <w:pPr>
+              <w:spacing w:after="0" w:line="240" w:lineRule="auto"/>
+              <w:rPr>
+                <w:rFonts w:ascii="Times New Roman" w:eastAsia="Times New Roman" w:hAnsi="Times New Roman" w:cs="Times New Roman"/>
+                <w:sz w:val="20"/>
+                <w:szCs w:val="20"/>
+                <w:lang w:val="es-419" w:eastAsia="es-419"/>
+              </w:rPr>
+            </w:pPr>
+          </w:p>
+        </w:tc>
+        <w:tc>
+          <w:tcPr>
+            <w:tcW w:w="1976" w:type="dxa"/>
+            <w:tcBorders>
+              <w:top w:val="nil"/>
+              <w:left w:val="nil"/>
+              <w:bottom w:val="nil"/>
+              <w:right w:val="nil"/>
+            </w:tcBorders>
+            <w:noWrap/>
+            <w:vAlign w:val="bottom"/>
+            <w:hideMark/>
+          </w:tcPr>
+          <w:p>
+            <w:pPr>
+              <w:spacing w:after="0" w:line="240" w:lineRule="auto"/>
+              <w:rPr>
+                <w:rFonts w:ascii="Times New Roman" w:eastAsia="Times New Roman" w:hAnsi="Times New Roman" w:cs="Times New Roman"/>
+                <w:sz w:val="20"/>
+                <w:szCs w:val="20"/>
+                <w:lang w:val="es-419" w:eastAsia="es-419"/>
+              </w:rPr>
+            </w:pPr>
+          </w:p>
+        </w:tc>
+      </w:tr>
+      <w:tr>
+        <w:trPr>
+          <w:trHeight w:val="240"/>
+        </w:trPr>
+        <w:tc>
+          <w:tcPr>
+            <w:tcW w:w="1843" w:type="dxa"/>
+            <w:tcBorders>
+              <w:top w:val="nil"/>
+              <w:left w:val="nil"/>
+              <w:bottom w:val="nil"/>
+              <w:right w:val="nil"/>
+            </w:tcBorders>
+            <w:noWrap/>
+            <w:vAlign w:val="center"/>
+            <w:hideMark/>
+          </w:tcPr>
+          <w:p>
+            <w:pPr>
+              <w:spacing w:after="0" w:line="240" w:lineRule="auto"/>
+              <w:rPr>
+                <w:rFonts w:ascii="Trebuchet MS" w:eastAsia="Times New Roman" w:hAnsi="Trebuchet MS" w:cs="Times New Roman"/>
+                <w:color w:val="000000"/>
+                <w:sz w:val="20"/>
+                <w:szCs w:val="20"/>
+                <w:lang w:val="es-419" w:eastAsia="es-419"/>
+              </w:rPr>
+            </w:pPr>
+            <w:r>
+              <w:rPr>
+                <w:rFonts w:ascii="Trebuchet MS" w:eastAsia="Times New Roman" w:hAnsi="Trebuchet MS" w:cs="Times New Roman"/>
+                <w:color w:val="000000"/>
+                <w:sz w:val="20"/>
+                <w:szCs w:val="20"/>
+                <w:lang w:val="es-419" w:eastAsia="es-419"/>
+              </w:rPr>
+              <w:t xml:space="preserve">        88,434 </w:t>
+            </w:r>
+          </w:p>
+        </w:tc>
+        <w:tc>
+          <w:tcPr>
+            <w:tcW w:w="1189" w:type="dxa"/>
+            <w:tcBorders>
+              <w:top w:val="nil"/>
+              <w:left w:val="nil"/>
+              <w:bottom w:val="nil"/>
+              <w:right w:val="nil"/>
+            </w:tcBorders>
+            <w:noWrap/>
+            <w:vAlign w:val="center"/>
+            <w:hideMark/>
+          </w:tcPr>
+          <w:p>
+            <w:pPr>
+              <w:spacing w:after="0" w:line="240" w:lineRule="auto"/>
+              <w:jc w:val="center"/>
+              <w:rPr>
+                <w:rFonts w:ascii="Trebuchet MS" w:eastAsia="Times New Roman" w:hAnsi="Trebuchet MS" w:cs="Times New Roman"/>
+                <w:color w:val="000000"/>
+                <w:sz w:val="20"/>
+                <w:szCs w:val="20"/>
+                <w:lang w:val="es-419" w:eastAsia="es-419"/>
+              </w:rPr>
+            </w:pPr>
+            <w:r>
+              <w:rPr>
+                <w:rFonts w:ascii="Trebuchet MS" w:eastAsia="Times New Roman" w:hAnsi="Trebuchet MS" w:cs="Times New Roman"/>
+                <w:color w:val="000000"/>
+                <w:sz w:val="20"/>
+                <w:szCs w:val="20"/>
+                <w:lang w:val="es-419" w:eastAsia="es-419"/>
+              </w:rPr>
+              <w:t>30/09/2023</w:t>
+            </w:r>
+          </w:p>
+        </w:tc>
+        <w:tc>
+          <w:tcPr>
+            <w:tcW w:w="1189" w:type="dxa"/>
+            <w:tcBorders>
+              <w:top w:val="nil"/>
+              <w:left w:val="nil"/>
+              <w:bottom w:val="nil"/>
+              <w:right w:val="nil"/>
+            </w:tcBorders>
+            <w:noWrap/>
+            <w:vAlign w:val="bottom"/>
+            <w:hideMark/>
+          </w:tcPr>
+          <w:p>
+            <w:pPr>
+              <w:spacing w:after="0" w:line="240" w:lineRule="auto"/>
+              <w:jc w:val="center"/>
+              <w:rPr>
+                <w:rFonts w:ascii="Trebuchet MS" w:eastAsia="Times New Roman" w:hAnsi="Trebuchet MS" w:cs="Times New Roman"/>
+                <w:color w:val="000000"/>
+                <w:sz w:val="20"/>
+                <w:szCs w:val="20"/>
+                <w:lang w:val="es-419" w:eastAsia="es-419"/>
+              </w:rPr>
+            </w:pPr>
+            <w:r>
+              <w:rPr>
+                <w:rFonts w:ascii="Trebuchet MS" w:eastAsia="Times New Roman" w:hAnsi="Trebuchet MS" w:cs="Times New Roman"/>
+                <w:color w:val="000000"/>
+                <w:sz w:val="20"/>
+                <w:szCs w:val="20"/>
+                <w:lang w:val="es-419" w:eastAsia="es-419"/>
+              </w:rPr>
+              <w:t>31/03/2027</w:t>
+            </w:r>
+          </w:p>
+        </w:tc>
+        <w:tc>
+          <w:tcPr>
+            <w:tcW w:w="1296" w:type="dxa"/>
+            <w:tcBorders>
+              <w:top w:val="nil"/>
+              <w:left w:val="nil"/>
+              <w:bottom w:val="nil"/>
+              <w:right w:val="nil"/>
+            </w:tcBorders>
+            <w:noWrap/>
+            <w:vAlign w:val="center"/>
+            <w:hideMark/>
+          </w:tcPr>
+          <w:p>
+            <w:pPr>
+              <w:spacing w:after="0" w:line="240" w:lineRule="auto"/>
+              <w:jc w:val="center"/>
+              <w:rPr>
+                <w:rFonts w:ascii="Trebuchet MS" w:eastAsia="Times New Roman" w:hAnsi="Trebuchet MS" w:cs="Times New Roman"/>
+                <w:color w:val="000000"/>
+                <w:sz w:val="20"/>
+                <w:szCs w:val="20"/>
+                <w:lang w:val="es-419" w:eastAsia="es-419"/>
+              </w:rPr>
+            </w:pPr>
+            <w:r>
+              <w:rPr>
+                <w:rFonts w:ascii="Trebuchet MS" w:eastAsia="Times New Roman" w:hAnsi="Trebuchet MS" w:cs="Times New Roman"/>
+                <w:color w:val="000000"/>
+                <w:sz w:val="20"/>
+                <w:szCs w:val="20"/>
+                <w:lang w:val="es-419" w:eastAsia="es-419"/>
+              </w:rPr>
+              <w:t>TIIE</w:t>
+            </w:r>
+          </w:p>
+        </w:tc>
+        <w:tc>
+          <w:tcPr>
+            <w:tcW w:w="1296" w:type="dxa"/>
+            <w:tcBorders>
+              <w:top w:val="nil"/>
+              <w:left w:val="nil"/>
+              <w:bottom w:val="nil"/>
+              <w:right w:val="nil"/>
+            </w:tcBorders>
+            <w:noWrap/>
+            <w:vAlign w:val="bottom"/>
+            <w:hideMark/>
+          </w:tcPr>
+          <w:p>
+            <w:pPr>
+              <w:spacing w:after="0" w:line="240" w:lineRule="auto"/>
+              <w:jc w:val="center"/>
+              <w:rPr>
+                <w:rFonts w:ascii="Trebuchet MS" w:eastAsia="Times New Roman" w:hAnsi="Trebuchet MS" w:cs="Times New Roman"/>
+                <w:color w:val="000000"/>
+                <w:sz w:val="20"/>
+                <w:szCs w:val="20"/>
+                <w:lang w:val="es-419" w:eastAsia="es-419"/>
+              </w:rPr>
+            </w:pPr>
+            <w:r>
+              <w:rPr>
+                <w:rFonts w:ascii="Trebuchet MS" w:eastAsia="Times New Roman" w:hAnsi="Trebuchet MS" w:cs="Times New Roman"/>
+                <w:color w:val="000000"/>
+                <w:sz w:val="20"/>
+                <w:szCs w:val="20"/>
+                <w:lang w:val="es-419" w:eastAsia="es-419"/>
+              </w:rPr>
+              <w:t>10.65%</w:t>
+            </w:r>
+          </w:p>
+        </w:tc>
+        <w:tc>
+          <w:tcPr>
+            <w:tcW w:w="1976" w:type="dxa"/>
+            <w:tcBorders>
+              <w:top w:val="nil"/>
+              <w:left w:val="nil"/>
+              <w:bottom w:val="nil"/>
+              <w:right w:val="nil"/>
+            </w:tcBorders>
+            <w:noWrap/>
+            <w:vAlign w:val="bottom"/>
+            <w:hideMark/>
+          </w:tcPr>
+          <w:p>
+            <w:pPr>
+              <w:spacing w:after="0" w:line="240" w:lineRule="auto"/>
+              <w:jc w:val="center"/>
+              <w:rPr>
+                <w:rFonts w:ascii="Trebuchet MS" w:eastAsia="Times New Roman" w:hAnsi="Trebuchet MS" w:cs="Times New Roman"/>
+                <w:color w:val="000000"/>
+                <w:sz w:val="20"/>
+                <w:szCs w:val="20"/>
+                <w:lang w:val="es-419" w:eastAsia="es-419"/>
+              </w:rPr>
+            </w:pPr>
+            <w:r>
+              <w:rPr>
+                <w:rFonts w:ascii="Trebuchet MS" w:eastAsia="Times New Roman" w:hAnsi="Trebuchet MS" w:cs="Times New Roman"/>
+                <w:color w:val="000000"/>
+                <w:sz w:val="20"/>
+                <w:szCs w:val="20"/>
+                <w:lang w:val="es-419" w:eastAsia="es-419"/>
+              </w:rPr>
+              <w:t>2,083</w:t>
+            </w:r>
+          </w:p>
+        </w:tc>
+      </w:tr>
+    </w:tbl>
+    <w:p>
+      <w:pPr>
+        <w:spacing w:after="160" w:line="259" w:lineRule="auto"/>
+      </w:pPr>
+    </w:p>
+    <w:tbl>
+      <w:tblPr>
+        <w:tblW w:w="8725" w:type="dxa"/>
+        <w:tblCellMar>
+          <w:left w:w="70" w:type="dxa"/>
+          <w:right w:w="70" w:type="dxa"/>
+        </w:tblCellMar>
+        <w:tblLook w:val="04A0" w:firstRow="1" w:lastRow="0" w:firstColumn="1" w:lastColumn="0" w:noHBand="0" w:noVBand="1"/>
+      </w:tblPr>
+      <w:tblGrid>
+        <w:gridCol w:w="4536"/>
+        <w:gridCol w:w="1216"/>
+        <w:gridCol w:w="296"/>
+        <w:gridCol w:w="1216"/>
+        <w:gridCol w:w="245"/>
+        <w:gridCol w:w="1216"/>
+      </w:tblGrid>
+      <w:tr>
+        <w:trPr>
+          <w:trHeight w:val="300"/>
+        </w:trPr>
+        <w:tc>
+          <w:tcPr>
+            <w:tcW w:w="4536" w:type="dxa"/>
+            <w:tcBorders>
+              <w:top w:val="nil"/>
+              <w:left w:val="nil"/>
+              <w:bottom w:val="nil"/>
+              <w:right w:val="nil"/>
+            </w:tcBorders>
+            <w:noWrap/>
+            <w:vAlign w:val="bottom"/>
+          </w:tcPr>
+          <w:p>
+            <w:pPr>
+              <w:spacing w:after="0" w:line="240" w:lineRule="auto"/>
+              <w:rPr>
+                <w:rFonts w:ascii="Trebuchet MS" w:eastAsia="Times New Roman" w:hAnsi="Trebuchet MS" w:cs="Times New Roman"/>
+                <w:b/>
+                <w:bCs/>
+                <w:color w:val="000000"/>
+                <w:sz w:val="16"/>
+                <w:szCs w:val="16"/>
+                <w:lang w:val="es-419" w:eastAsia="es-419"/>
+              </w:rPr>
+            </w:pPr>
+            <w:r>
+              <w:rPr>
+                <w:rFonts w:ascii="Trebuchet MS" w:eastAsia="Times New Roman" w:hAnsi="Trebuchet MS" w:cs="Times New Roman"/>
+                <w:b/>
+                <w:bCs/>
+                <w:color w:val="000000"/>
+                <w:sz w:val="16"/>
+                <w:szCs w:val="16"/>
+                <w:lang w:val="es-419" w:eastAsia="es-419"/>
+              </w:rPr>
+              <w:t>[[MODELO_</w:t>
+            </w:r>
+            <w:r>
+              <w:rPr>
+                <w:rFonts w:ascii="Trebuchet MS" w:eastAsia="Times New Roman" w:hAnsi="Trebuchet MS" w:cs="Times New Roman"/>
+                <w:b/>
+                <w:bCs/>
+                <w:color w:val="000000"/>
+                <w:sz w:val="16"/>
+                <w:szCs w:val="16"/>
+                <w:lang w:val="es-419" w:eastAsia="es-419"/>
+              </w:rPr>
+              <w:t>SUBS</w:t>
+            </w:r>
+            <w:r>
+              <w:rPr>
+                <w:rFonts w:ascii="Trebuchet MS" w:eastAsia="Times New Roman" w:hAnsi="Trebuchet MS" w:cs="Times New Roman"/>
+                <w:b/>
+                <w:bCs/>
+                <w:color w:val="000000"/>
+                <w:sz w:val="16"/>
+                <w:szCs w:val="16"/>
+                <w:lang w:val="es-419" w:eastAsia="es-419"/>
+              </w:rPr>
+              <w:t>IYPATRI</w:t>
+            </w:r>
+            <w:r>
+              <w:rPr>
+                <w:rFonts w:ascii="Trebuchet MS" w:eastAsia="Times New Roman" w:hAnsi="Trebuchet MS" w:cs="Times New Roman"/>
+                <w:b/>
+                <w:bCs/>
+                <w:color w:val="000000"/>
+                <w:sz w:val="16"/>
+                <w:szCs w:val="16"/>
+                <w:lang w:val="es-419" w:eastAsia="es-419"/>
+              </w:rPr>
+              <w:t>]]</w:t>
+            </w:r>
+          </w:p>
+        </w:tc>
+        <w:tc>
+          <w:tcPr>
+            <w:tcW w:w="1216" w:type="dxa"/>
+            <w:tcBorders>
+              <w:top w:val="nil"/>
+              <w:left w:val="nil"/>
+              <w:bottom w:val="nil"/>
+              <w:right w:val="nil"/>
+            </w:tcBorders>
+            <w:noWrap/>
+            <w:vAlign w:val="bottom"/>
+          </w:tcPr>
+          <w:p>
+            <w:pPr>
+              <w:spacing w:after="0" w:line="240" w:lineRule="auto"/>
+              <w:rPr>
+                <w:rFonts w:ascii="Times New Roman" w:eastAsia="Times New Roman" w:hAnsi="Times New Roman" w:cs="Times New Roman"/>
+                <w:sz w:val="20"/>
+                <w:szCs w:val="20"/>
+                <w:lang w:val="es-419" w:eastAsia="es-419"/>
+              </w:rPr>
+            </w:pPr>
+          </w:p>
+        </w:tc>
+        <w:tc>
+          <w:tcPr>
+            <w:tcW w:w="296" w:type="dxa"/>
+            <w:tcBorders>
+              <w:top w:val="nil"/>
+              <w:left w:val="nil"/>
+              <w:bottom w:val="nil"/>
+              <w:right w:val="nil"/>
+            </w:tcBorders>
+            <w:noWrap/>
+            <w:vAlign w:val="bottom"/>
+          </w:tcPr>
+          <w:p>
+            <w:pPr>
+              <w:spacing w:after="0" w:line="240" w:lineRule="auto"/>
+              <w:rPr>
+                <w:rFonts w:ascii="Times New Roman" w:eastAsia="Times New Roman" w:hAnsi="Times New Roman" w:cs="Times New Roman"/>
+                <w:sz w:val="20"/>
+                <w:szCs w:val="20"/>
+                <w:lang w:val="es-419" w:eastAsia="es-419"/>
+              </w:rPr>
+            </w:pPr>
+          </w:p>
+        </w:tc>
+        <w:tc>
+          <w:tcPr>
+            <w:tcW w:w="1216" w:type="dxa"/>
+            <w:tcBorders>
+              <w:top w:val="nil"/>
+              <w:left w:val="nil"/>
+              <w:bottom w:val="nil"/>
+              <w:right w:val="nil"/>
+            </w:tcBorders>
+            <w:noWrap/>
+            <w:vAlign w:val="bottom"/>
+          </w:tcPr>
+          <w:p>
+            <w:pPr>
+              <w:spacing w:after="0" w:line="240" w:lineRule="auto"/>
+              <w:rPr>
+                <w:rFonts w:ascii="Times New Roman" w:eastAsia="Times New Roman" w:hAnsi="Times New Roman" w:cs="Times New Roman"/>
+                <w:sz w:val="20"/>
+                <w:szCs w:val="20"/>
+                <w:lang w:val="es-419" w:eastAsia="es-419"/>
+              </w:rPr>
+            </w:pPr>
+          </w:p>
+        </w:tc>
+        <w:tc>
+          <w:tcPr>
+            <w:tcW w:w="245" w:type="dxa"/>
+            <w:tcBorders>
+              <w:top w:val="nil"/>
+              <w:left w:val="nil"/>
+              <w:bottom w:val="nil"/>
+              <w:right w:val="nil"/>
+            </w:tcBorders>
+            <w:noWrap/>
+            <w:vAlign w:val="bottom"/>
+          </w:tcPr>
+          <w:p>
+            <w:pPr>
+              <w:spacing w:after="0" w:line="240" w:lineRule="auto"/>
+              <w:rPr>
+                <w:rFonts w:ascii="Times New Roman" w:eastAsia="Times New Roman" w:hAnsi="Times New Roman" w:cs="Times New Roman"/>
+                <w:sz w:val="20"/>
+                <w:szCs w:val="20"/>
+                <w:lang w:val="es-419" w:eastAsia="es-419"/>
+              </w:rPr>
+            </w:pPr>
+          </w:p>
+        </w:tc>
+        <w:tc>
+          <w:tcPr>
+            <w:tcW w:w="1216" w:type="dxa"/>
+            <w:tcBorders>
+              <w:top w:val="nil"/>
+              <w:left w:val="nil"/>
+              <w:bottom w:val="nil"/>
+              <w:right w:val="nil"/>
+            </w:tcBorders>
+            <w:noWrap/>
+            <w:vAlign w:val="bottom"/>
+          </w:tcPr>
+          <w:p>
+            <w:pPr>
+              <w:spacing w:after="0" w:line="240" w:lineRule="auto"/>
+              <w:rPr>
+                <w:rFonts w:ascii="Times New Roman" w:eastAsia="Times New Roman" w:hAnsi="Times New Roman" w:cs="Times New Roman"/>
+                <w:sz w:val="20"/>
+                <w:szCs w:val="20"/>
+                <w:lang w:val="es-419" w:eastAsia="es-419"/>
+              </w:rPr>
+            </w:pPr>
+          </w:p>
+        </w:tc>
+      </w:tr>
+      <w:tr>
+        <w:trPr>
+          <w:trHeight w:val="280"/>
+        </w:trPr>
+        <w:tc>
+          <w:tcPr>
+            <w:tcW w:w="4536" w:type="dxa"/>
+            <w:tcBorders>
+              <w:top w:val="nil"/>
+              <w:left w:val="nil"/>
+              <w:bottom w:val="nil"/>
+              <w:right w:val="nil"/>
+            </w:tcBorders>
+            <w:vAlign w:val="center"/>
+            <w:hideMark/>
+          </w:tcPr>
+          <w:p>
+            <w:pPr>
+              <w:spacing w:after="0" w:line="240" w:lineRule="auto"/>
+              <w:jc w:val="center"/>
+              <w:rPr>
+                <w:rFonts w:ascii="Trebuchet MS" w:eastAsia="Times New Roman" w:hAnsi="Trebuchet MS" w:cs="Times New Roman"/>
+                <w:b/>
+                <w:bCs/>
+                <w:color w:val="000000"/>
+                <w:sz w:val="16"/>
+                <w:szCs w:val="16"/>
+                <w:lang w:val="es-419" w:eastAsia="es-419"/>
+              </w:rPr>
+            </w:pPr>
+            <w:r>
+              <w:rPr>
+                <w:rFonts w:ascii="Trebuchet MS" w:eastAsia="Times New Roman" w:hAnsi="Trebuchet MS" w:cs="Times New Roman"/>
+                <w:b/>
+                <w:bCs/>
+                <w:color w:val="000000"/>
+                <w:sz w:val="16"/>
+                <w:szCs w:val="16"/>
+                <w:lang w:val="es-419" w:eastAsia="es-419"/>
+              </w:rPr>
+              <w:t xml:space="preserve">Compañía </w:t>
+            </w:r>
+          </w:p>
+        </w:tc>
+        <w:tc>
+          <w:tcPr>
+            <w:tcW w:w="1216" w:type="dxa"/>
+            <w:tcBorders>
+              <w:top w:val="nil"/>
+              <w:left w:val="nil"/>
+              <w:bottom w:val="nil"/>
+              <w:right w:val="nil"/>
+            </w:tcBorders>
+            <w:vAlign w:val="center"/>
+            <w:hideMark/>
+          </w:tcPr>
+          <w:p>
+            <w:pPr>
+              <w:spacing w:after="0" w:line="240" w:lineRule="auto"/>
+              <w:jc w:val="center"/>
+              <w:rPr>
+                <w:rFonts w:ascii="Trebuchet MS" w:eastAsia="Times New Roman" w:hAnsi="Trebuchet MS" w:cs="Times New Roman"/>
+                <w:b/>
+                <w:bCs/>
+                <w:color w:val="000000"/>
+                <w:sz w:val="16"/>
+                <w:szCs w:val="16"/>
+                <w:lang w:val="es-419" w:eastAsia="es-419"/>
+              </w:rPr>
+            </w:pPr>
+            <w:r>
+              <w:rPr>
+                <w:rFonts w:ascii="Trebuchet MS" w:eastAsia="Times New Roman" w:hAnsi="Trebuchet MS" w:cs="Times New Roman"/>
+                <w:b/>
+                <w:bCs/>
+                <w:color w:val="000000"/>
+                <w:sz w:val="16"/>
+                <w:szCs w:val="16"/>
+                <w:lang w:val="es-419" w:eastAsia="es-419"/>
+              </w:rPr>
+              <w:t>% Participación</w:t>
+            </w:r>
+          </w:p>
+        </w:tc>
+        <w:tc>
+          <w:tcPr>
+            <w:tcW w:w="296" w:type="dxa"/>
+            <w:tcBorders>
+              <w:top w:val="nil"/>
+              <w:left w:val="nil"/>
+              <w:bottom w:val="nil"/>
+              <w:right w:val="nil"/>
+            </w:tcBorders>
+            <w:vAlign w:val="center"/>
+            <w:hideMark/>
+          </w:tcPr>
+          <w:p>
+            <w:pPr>
+              <w:spacing w:after="0" w:line="240" w:lineRule="auto"/>
+              <w:jc w:val="center"/>
+              <w:rPr>
+                <w:rFonts w:ascii="Trebuchet MS" w:eastAsia="Times New Roman" w:hAnsi="Trebuchet MS" w:cs="Times New Roman"/>
+                <w:b/>
+                <w:bCs/>
+                <w:color w:val="000000"/>
+                <w:sz w:val="16"/>
+                <w:szCs w:val="16"/>
+                <w:lang w:val="es-419" w:eastAsia="es-419"/>
+              </w:rPr>
+            </w:pPr>
+          </w:p>
+        </w:tc>
+        <w:tc>
+          <w:tcPr>
+            <w:tcW w:w="1216" w:type="dxa"/>
+            <w:tcBorders>
+              <w:top w:val="nil"/>
+              <w:left w:val="nil"/>
+              <w:bottom w:val="nil"/>
+              <w:right w:val="nil"/>
+            </w:tcBorders>
+            <w:vAlign w:val="center"/>
+            <w:hideMark/>
+          </w:tcPr>
+          <w:p>
+            <w:pPr>
+              <w:spacing w:after="0" w:line="240" w:lineRule="auto"/>
+              <w:jc w:val="center"/>
+              <w:rPr>
+                <w:rFonts w:ascii="Trebuchet MS" w:eastAsia="Times New Roman" w:hAnsi="Trebuchet MS" w:cs="Times New Roman"/>
+                <w:b/>
+                <w:bCs/>
+                <w:color w:val="000000"/>
+                <w:sz w:val="16"/>
+                <w:szCs w:val="16"/>
+                <w:lang w:val="es-419" w:eastAsia="es-419"/>
+              </w:rPr>
+            </w:pPr>
+            <w:r>
+              <w:rPr>
+                <w:rFonts w:ascii="Trebuchet MS" w:eastAsia="Times New Roman" w:hAnsi="Trebuchet MS" w:cs="Times New Roman"/>
+                <w:b/>
+                <w:bCs/>
+                <w:color w:val="000000"/>
+                <w:sz w:val="16"/>
+                <w:szCs w:val="16"/>
+                <w:lang w:val="es-419" w:eastAsia="es-419"/>
+              </w:rPr>
+              <w:t>2025</w:t>
+            </w:r>
+          </w:p>
+        </w:tc>
+        <w:tc>
+          <w:tcPr>
+            <w:tcW w:w="245" w:type="dxa"/>
+            <w:tcBorders>
+              <w:top w:val="nil"/>
+              <w:left w:val="nil"/>
+              <w:bottom w:val="nil"/>
+              <w:right w:val="nil"/>
+            </w:tcBorders>
+            <w:vAlign w:val="center"/>
+            <w:hideMark/>
+          </w:tcPr>
+          <w:p>
+            <w:pPr>
+              <w:spacing w:after="0" w:line="240" w:lineRule="auto"/>
+              <w:jc w:val="center"/>
+              <w:rPr>
+                <w:rFonts w:ascii="Trebuchet MS" w:eastAsia="Times New Roman" w:hAnsi="Trebuchet MS" w:cs="Times New Roman"/>
+                <w:b/>
+                <w:bCs/>
+                <w:color w:val="000000"/>
+                <w:sz w:val="16"/>
+                <w:szCs w:val="16"/>
+                <w:lang w:val="es-419" w:eastAsia="es-419"/>
+              </w:rPr>
+            </w:pPr>
+          </w:p>
+        </w:tc>
+        <w:tc>
+          <w:tcPr>
+            <w:tcW w:w="1216" w:type="dxa"/>
+            <w:tcBorders>
+              <w:top w:val="nil"/>
+              <w:left w:val="nil"/>
+              <w:bottom w:val="nil"/>
+              <w:right w:val="nil"/>
+            </w:tcBorders>
+            <w:vAlign w:val="center"/>
+            <w:hideMark/>
+          </w:tcPr>
+          <w:p>
+            <w:pPr>
+              <w:spacing w:after="0" w:line="240" w:lineRule="auto"/>
+              <w:jc w:val="center"/>
+              <w:rPr>
+                <w:rFonts w:ascii="Trebuchet MS" w:eastAsia="Times New Roman" w:hAnsi="Trebuchet MS" w:cs="Times New Roman"/>
+                <w:b/>
+                <w:bCs/>
+                <w:color w:val="000000"/>
+                <w:sz w:val="16"/>
+                <w:szCs w:val="16"/>
+                <w:lang w:val="es-419" w:eastAsia="es-419"/>
+              </w:rPr>
+            </w:pPr>
+            <w:r>
+              <w:rPr>
+                <w:rFonts w:ascii="Trebuchet MS" w:eastAsia="Times New Roman" w:hAnsi="Trebuchet MS" w:cs="Times New Roman"/>
+                <w:b/>
+                <w:bCs/>
+                <w:color w:val="000000"/>
+                <w:sz w:val="16"/>
+                <w:szCs w:val="16"/>
+                <w:lang w:val="es-419" w:eastAsia="es-419"/>
+              </w:rPr>
+              <w:t>2024</w:t>
+            </w:r>
+          </w:p>
+        </w:tc>
+      </w:tr>
+      <w:tr>
+        <w:trPr>
+          <w:trHeight w:val="300"/>
+        </w:trPr>
+        <w:tc>
+          <w:tcPr>
+            <w:tcW w:w="4536" w:type="dxa"/>
+            <w:tcBorders>
+              <w:top w:val="nil"/>
+              <w:left w:val="nil"/>
+              <w:bottom w:val="nil"/>
+              <w:right w:val="nil"/>
+            </w:tcBorders>
+            <w:vAlign w:val="center"/>
+            <w:hideMark/>
+          </w:tcPr>
+          <w:p>
+            <w:pPr>
+              <w:spacing w:after="0" w:line="240" w:lineRule="auto"/>
+              <w:jc w:val="center"/>
+              <w:rPr>
+                <w:rFonts w:ascii="Trebuchet MS" w:eastAsia="Times New Roman" w:hAnsi="Trebuchet MS" w:cs="Times New Roman"/>
+                <w:b/>
+                <w:bCs/>
+                <w:color w:val="000000"/>
+                <w:sz w:val="16"/>
+                <w:szCs w:val="16"/>
+                <w:lang w:val="es-419" w:eastAsia="es-419"/>
+              </w:rPr>
+            </w:pPr>
+          </w:p>
+        </w:tc>
+        <w:tc>
+          <w:tcPr>
+            <w:tcW w:w="1216" w:type="dxa"/>
+            <w:tcBorders>
+              <w:top w:val="nil"/>
+              <w:left w:val="nil"/>
+              <w:bottom w:val="nil"/>
+              <w:right w:val="nil"/>
+            </w:tcBorders>
+            <w:vAlign w:val="center"/>
+            <w:hideMark/>
+          </w:tcPr>
+          <w:p>
+            <w:pPr>
+              <w:spacing w:after="0" w:line="240" w:lineRule="auto"/>
+              <w:rPr>
+                <w:rFonts w:ascii="Times New Roman" w:eastAsia="Times New Roman" w:hAnsi="Times New Roman" w:cs="Times New Roman"/>
+                <w:sz w:val="20"/>
+                <w:szCs w:val="20"/>
+                <w:lang w:val="es-419" w:eastAsia="es-419"/>
+              </w:rPr>
+            </w:pPr>
+          </w:p>
+        </w:tc>
+        <w:tc>
+          <w:tcPr>
+            <w:tcW w:w="296" w:type="dxa"/>
+            <w:tcBorders>
+              <w:top w:val="nil"/>
+              <w:left w:val="nil"/>
+              <w:bottom w:val="nil"/>
+              <w:right w:val="nil"/>
+            </w:tcBorders>
+            <w:vAlign w:val="center"/>
+            <w:hideMark/>
+          </w:tcPr>
+          <w:p>
+            <w:pPr>
+              <w:spacing w:after="0" w:line="240" w:lineRule="auto"/>
+              <w:rPr>
+                <w:rFonts w:ascii="Times New Roman" w:eastAsia="Times New Roman" w:hAnsi="Times New Roman" w:cs="Times New Roman"/>
+                <w:sz w:val="20"/>
+                <w:szCs w:val="20"/>
+                <w:lang w:val="es-419" w:eastAsia="es-419"/>
+              </w:rPr>
+            </w:pPr>
+          </w:p>
+        </w:tc>
+        <w:tc>
+          <w:tcPr>
+            <w:tcW w:w="1216" w:type="dxa"/>
+            <w:tcBorders>
+              <w:top w:val="nil"/>
+              <w:left w:val="nil"/>
+              <w:right w:val="nil"/>
+            </w:tcBorders>
+            <w:vAlign w:val="center"/>
+            <w:hideMark/>
+          </w:tcPr>
+          <w:p>
+            <w:pPr>
+              <w:spacing w:after="0" w:line="240" w:lineRule="auto"/>
+              <w:rPr>
+                <w:rFonts w:ascii="Times New Roman" w:eastAsia="Times New Roman" w:hAnsi="Times New Roman" w:cs="Times New Roman"/>
+                <w:sz w:val="20"/>
+                <w:szCs w:val="20"/>
+                <w:lang w:val="es-419" w:eastAsia="es-419"/>
+              </w:rPr>
+            </w:pPr>
+          </w:p>
+        </w:tc>
+        <w:tc>
+          <w:tcPr>
+            <w:tcW w:w="245" w:type="dxa"/>
+            <w:tcBorders>
+              <w:top w:val="nil"/>
+              <w:left w:val="nil"/>
+              <w:right w:val="nil"/>
+            </w:tcBorders>
+            <w:vAlign w:val="center"/>
+            <w:hideMark/>
+          </w:tcPr>
+          <w:p>
+            <w:pPr>
+              <w:spacing w:after="0" w:line="240" w:lineRule="auto"/>
+              <w:rPr>
+                <w:rFonts w:ascii="Times New Roman" w:eastAsia="Times New Roman" w:hAnsi="Times New Roman" w:cs="Times New Roman"/>
+                <w:sz w:val="20"/>
+                <w:szCs w:val="20"/>
+                <w:lang w:val="es-419" w:eastAsia="es-419"/>
+              </w:rPr>
+            </w:pPr>
+          </w:p>
+        </w:tc>
+        <w:tc>
+          <w:tcPr>
+            <w:tcW w:w="1216" w:type="dxa"/>
+            <w:tcBorders>
+              <w:top w:val="nil"/>
+              <w:left w:val="nil"/>
+              <w:right w:val="nil"/>
+            </w:tcBorders>
+            <w:vAlign w:val="center"/>
+            <w:hideMark/>
+          </w:tcPr>
+          <w:p>
+            <w:pPr>
+              <w:spacing w:after="0" w:line="240" w:lineRule="auto"/>
+              <w:rPr>
+                <w:rFonts w:ascii="Times New Roman" w:eastAsia="Times New Roman" w:hAnsi="Times New Roman" w:cs="Times New Roman"/>
+                <w:sz w:val="20"/>
+                <w:szCs w:val="20"/>
+                <w:lang w:val="es-419" w:eastAsia="es-419"/>
+              </w:rPr>
+            </w:pPr>
+          </w:p>
+        </w:tc>
+      </w:tr>
+      <w:tr>
+        <w:trPr>
+          <w:trHeight w:val="433"/>
+        </w:trPr>
+        <w:tc>
+          <w:tcPr>
+            <w:tcW w:w="4536" w:type="dxa"/>
+            <w:tcBorders>
+              <w:top w:val="nil"/>
+              <w:left w:val="nil"/>
+              <w:bottom w:val="nil"/>
+              <w:right w:val="nil"/>
+            </w:tcBorders>
+            <w:noWrap/>
+            <w:vAlign w:val="bottom"/>
+            <w:hideMark/>
+          </w:tcPr>
+          <w:p>
+            <w:pPr>
+              <w:spacing w:after="0" w:line="240" w:lineRule="auto"/>
+              <w:rPr>
+                <w:rFonts w:ascii="Trebuchet MS" w:eastAsia="Times New Roman" w:hAnsi="Trebuchet MS" w:cs="Times New Roman"/>
+                <w:color w:val="000000"/>
+                <w:sz w:val="20"/>
+                <w:szCs w:val="20"/>
+                <w:lang w:val="es-419" w:eastAsia="es-419"/>
+              </w:rPr>
+            </w:pPr>
+            <w:r>
+              <w:rPr>
+                <w:rFonts w:ascii="Trebuchet MS" w:eastAsia="Times New Roman" w:hAnsi="Trebuchet MS" w:cs="Times New Roman"/>
+                <w:color w:val="000000"/>
+                <w:sz w:val="20"/>
+                <w:szCs w:val="20"/>
+                <w:lang w:val="es-419" w:eastAsia="es-419"/>
+              </w:rPr>
+              <w:t>Operadora FC 1918 SA de CV</w:t>
+            </w:r>
+          </w:p>
+        </w:tc>
+        <w:tc>
+          <w:tcPr>
+            <w:tcW w:w="1216" w:type="dxa"/>
+            <w:tcBorders>
+              <w:top w:val="nil"/>
+              <w:left w:val="nil"/>
+              <w:bottom w:val="nil"/>
+              <w:right w:val="nil"/>
+            </w:tcBorders>
+            <w:vAlign w:val="center"/>
+            <w:hideMark/>
+          </w:tcPr>
+          <w:p>
+            <w:pPr>
+              <w:spacing w:after="0" w:line="240" w:lineRule="auto"/>
+              <w:jc w:val="center"/>
+              <w:rPr>
+                <w:rFonts w:ascii="Trebuchet MS" w:eastAsia="Times New Roman" w:hAnsi="Trebuchet MS" w:cs="Times New Roman"/>
+                <w:color w:val="000000"/>
+                <w:sz w:val="20"/>
+                <w:szCs w:val="20"/>
+                <w:lang w:val="es-419" w:eastAsia="es-419"/>
+              </w:rPr>
+            </w:pPr>
+            <w:r>
+              <w:rPr>
+                <w:rFonts w:ascii="Trebuchet MS" w:eastAsia="Times New Roman" w:hAnsi="Trebuchet MS" w:cs="Times New Roman"/>
+                <w:color w:val="000000"/>
+                <w:sz w:val="20"/>
+                <w:szCs w:val="20"/>
+                <w:lang w:val="es-419" w:eastAsia="es-419"/>
+              </w:rPr>
+              <w:t>60.81%</w:t>
+            </w:r>
+          </w:p>
+        </w:tc>
+        <w:tc>
+          <w:tcPr>
+            <w:tcW w:w="296" w:type="dxa"/>
+            <w:tcBorders>
+              <w:top w:val="nil"/>
+              <w:left w:val="nil"/>
+              <w:bottom w:val="nil"/>
+              <w:right w:val="nil"/>
+            </w:tcBorders>
+            <w:vAlign w:val="center"/>
+            <w:hideMark/>
+          </w:tcPr>
+          <w:p>
+            <w:pPr>
+              <w:spacing w:after="0" w:line="240" w:lineRule="auto"/>
+              <w:rPr>
+                <w:rFonts w:ascii="Trebuchet MS" w:eastAsia="Times New Roman" w:hAnsi="Trebuchet MS" w:cs="Times New Roman"/>
+                <w:color w:val="000000"/>
+                <w:sz w:val="20"/>
+                <w:szCs w:val="20"/>
+                <w:lang w:val="es-419" w:eastAsia="es-419"/>
+              </w:rPr>
+            </w:pPr>
+            <w:r>
+              <w:rPr>
+                <w:rFonts w:ascii="Trebuchet MS" w:eastAsia="Times New Roman" w:hAnsi="Trebuchet MS" w:cs="Times New Roman"/>
+                <w:color w:val="000000"/>
+                <w:sz w:val="20"/>
+                <w:szCs w:val="20"/>
+                <w:lang w:val="es-419" w:eastAsia="es-419"/>
+              </w:rPr>
+              <w:t>$</w:t>
+            </w:r>
+          </w:p>
+        </w:tc>
+        <w:tc>
+          <w:tcPr>
+            <w:tcW w:w="1216" w:type="dxa"/>
+            <w:tcBorders>
+              <w:top w:val="nil"/>
+              <w:left w:val="nil"/>
+              <w:right w:val="nil"/>
+            </w:tcBorders>
+            <w:vAlign w:val="center"/>
+            <w:hideMark/>
+          </w:tcPr>
+          <w:p>
+            <w:pPr>
+              <w:tabs>
+                <w:tab w:val="decimal" w:pos="968"/>
+              </w:tabs>
+              <w:spacing w:after="0" w:line="240" w:lineRule="auto"/>
+              <w:rPr>
+                <w:rFonts w:ascii="Trebuchet MS" w:eastAsia="Times New Roman" w:hAnsi="Trebuchet MS" w:cs="Times New Roman"/>
+                <w:color w:val="000000"/>
+                <w:sz w:val="20"/>
+                <w:szCs w:val="20"/>
+                <w:lang w:val="es-419" w:eastAsia="es-419"/>
+              </w:rPr>
+            </w:pPr>
+            <w:r>
+              <w:rPr>
+                <w:rFonts w:ascii="Trebuchet MS" w:eastAsia="Times New Roman" w:hAnsi="Trebuchet MS" w:cs="Times New Roman"/>
+                <w:color w:val="000000"/>
+                <w:sz w:val="20"/>
+                <w:szCs w:val="20"/>
+                <w:lang w:val="es-419" w:eastAsia="es-419"/>
+              </w:rPr>
+              <w:t>(13,122)</w:t>
+            </w:r>
+          </w:p>
+        </w:tc>
+        <w:tc>
+          <w:tcPr>
+            <w:tcW w:w="245" w:type="dxa"/>
+            <w:tcBorders>
+              <w:top w:val="nil"/>
+              <w:left w:val="nil"/>
+              <w:right w:val="nil"/>
+            </w:tcBorders>
+            <w:vAlign w:val="center"/>
+            <w:hideMark/>
+          </w:tcPr>
+          <w:p>
+            <w:pPr>
+              <w:spacing w:after="0" w:line="240" w:lineRule="auto"/>
+              <w:rPr>
+                <w:rFonts w:ascii="Trebuchet MS" w:eastAsia="Times New Roman" w:hAnsi="Trebuchet MS" w:cs="Times New Roman"/>
+                <w:color w:val="000000"/>
+                <w:sz w:val="20"/>
+                <w:szCs w:val="20"/>
+                <w:lang w:val="es-419" w:eastAsia="es-419"/>
+              </w:rPr>
+            </w:pPr>
+            <w:r>
+              <w:rPr>
+                <w:rFonts w:ascii="Trebuchet MS" w:eastAsia="Times New Roman" w:hAnsi="Trebuchet MS" w:cs="Times New Roman"/>
+                <w:color w:val="000000"/>
+                <w:sz w:val="20"/>
+                <w:szCs w:val="20"/>
+                <w:lang w:val="es-419" w:eastAsia="es-419"/>
+              </w:rPr>
+              <w:t>$</w:t>
+            </w:r>
+          </w:p>
+        </w:tc>
+        <w:tc>
+          <w:tcPr>
+            <w:tcW w:w="1216" w:type="dxa"/>
+            <w:tcBorders>
+              <w:top w:val="nil"/>
+              <w:left w:val="nil"/>
+              <w:right w:val="nil"/>
+            </w:tcBorders>
+            <w:vAlign w:val="center"/>
+            <w:hideMark/>
+          </w:tcPr>
+          <w:p>
+            <w:pPr>
+              <w:tabs>
+                <w:tab w:val="decimal" w:pos="930"/>
+              </w:tabs>
+              <w:spacing w:after="0" w:line="240" w:lineRule="auto"/>
+              <w:rPr>
+                <w:rFonts w:ascii="Trebuchet MS" w:eastAsia="Times New Roman" w:hAnsi="Trebuchet MS" w:cs="Times New Roman"/>
+                <w:color w:val="000000"/>
+                <w:sz w:val="20"/>
+                <w:szCs w:val="20"/>
+                <w:lang w:val="es-419" w:eastAsia="es-419"/>
+              </w:rPr>
+            </w:pPr>
+            <w:r>
+              <w:rPr>
+                <w:rFonts w:ascii="Trebuchet MS" w:eastAsia="Times New Roman" w:hAnsi="Trebuchet MS" w:cs="Times New Roman"/>
+                <w:color w:val="000000"/>
+                <w:sz w:val="20"/>
+                <w:szCs w:val="20"/>
+                <w:lang w:val="es-419" w:eastAsia="es-419"/>
+              </w:rPr>
+              <w:t>(7,732)</w:t>
+            </w:r>
+          </w:p>
+        </w:tc>
+      </w:tr>
+      <w:tr>
+        <w:trPr>
+          <w:trHeight w:val="400"/>
+        </w:trPr>
+        <w:tc>
+          <w:tcPr>
+            <w:tcW w:w="4536" w:type="dxa"/>
+            <w:tcBorders>
+              <w:top w:val="nil"/>
+              <w:left w:val="nil"/>
+              <w:bottom w:val="nil"/>
+              <w:right w:val="nil"/>
+            </w:tcBorders>
+            <w:vAlign w:val="center"/>
+            <w:hideMark/>
+          </w:tcPr>
+          <w:p>
+            <w:pPr>
+              <w:spacing w:after="0" w:line="240" w:lineRule="auto"/>
+              <w:rPr>
+                <w:rFonts w:ascii="Trebuchet MS" w:eastAsia="Times New Roman" w:hAnsi="Trebuchet MS" w:cs="Times New Roman"/>
+                <w:color w:val="000000"/>
+                <w:sz w:val="20"/>
+                <w:szCs w:val="20"/>
+                <w:lang w:val="es-419" w:eastAsia="es-419"/>
+              </w:rPr>
+            </w:pPr>
+            <w:proofErr w:type="gramStart"/>
+            <w:r>
+              <w:rPr>
+                <w:rFonts w:ascii="Trebuchet MS" w:eastAsia="Times New Roman" w:hAnsi="Trebuchet MS" w:cs="Times New Roman"/>
+                <w:color w:val="000000"/>
+                <w:sz w:val="20"/>
+                <w:szCs w:val="20"/>
+                <w:lang w:val="es-419" w:eastAsia="es-419"/>
+              </w:rPr>
+              <w:t>Total</w:t>
+            </w:r>
+            <w:proofErr w:type="gramEnd"/>
+            <w:r>
+              <w:rPr>
+                <w:rFonts w:ascii="Trebuchet MS" w:eastAsia="Times New Roman" w:hAnsi="Trebuchet MS" w:cs="Times New Roman"/>
+                <w:color w:val="000000"/>
+                <w:sz w:val="20"/>
+                <w:szCs w:val="20"/>
+                <w:lang w:val="es-419" w:eastAsia="es-419"/>
+              </w:rPr>
+              <w:t xml:space="preserve"> de provisión de pérdidas por subsidiarias</w:t>
+            </w:r>
+          </w:p>
+        </w:tc>
+        <w:tc>
+          <w:tcPr>
+            <w:tcW w:w="1216" w:type="dxa"/>
+            <w:tcBorders>
+              <w:top w:val="nil"/>
+              <w:left w:val="nil"/>
+              <w:bottom w:val="nil"/>
+              <w:right w:val="nil"/>
+            </w:tcBorders>
+            <w:vAlign w:val="center"/>
+            <w:hideMark/>
+          </w:tcPr>
+          <w:p>
+            <w:pPr>
+              <w:spacing w:after="0" w:line="240" w:lineRule="auto"/>
+              <w:rPr>
+                <w:rFonts w:ascii="Times New Roman" w:eastAsia="Times New Roman" w:hAnsi="Times New Roman" w:cs="Times New Roman"/>
+                <w:sz w:val="20"/>
+                <w:szCs w:val="20"/>
+                <w:lang w:val="es-419" w:eastAsia="es-419"/>
+              </w:rPr>
+            </w:pPr>
+          </w:p>
+        </w:tc>
+        <w:tc>
+          <w:tcPr>
+            <w:tcW w:w="296" w:type="dxa"/>
+            <w:tcBorders>
+              <w:top w:val="nil"/>
+              <w:left w:val="nil"/>
+              <w:bottom w:val="nil"/>
+              <w:right w:val="nil"/>
+            </w:tcBorders>
+            <w:vAlign w:val="center"/>
+            <w:hideMark/>
+          </w:tcPr>
+          <w:p>
+            <w:pPr>
+              <w:spacing w:after="0" w:line="240" w:lineRule="auto"/>
+              <w:rPr>
+                <w:rFonts w:ascii="Trebuchet MS" w:eastAsia="Times New Roman" w:hAnsi="Trebuchet MS" w:cs="Times New Roman"/>
+                <w:color w:val="000000"/>
+                <w:sz w:val="20"/>
+                <w:szCs w:val="20"/>
+                <w:lang w:val="es-419" w:eastAsia="es-419"/>
+              </w:rPr>
+            </w:pPr>
+            <w:r>
+              <w:rPr>
+                <w:rFonts w:ascii="Trebuchet MS" w:eastAsia="Times New Roman" w:hAnsi="Trebuchet MS" w:cs="Times New Roman"/>
+                <w:color w:val="000000"/>
+                <w:sz w:val="20"/>
+                <w:szCs w:val="20"/>
+                <w:lang w:val="es-419" w:eastAsia="es-419"/>
+              </w:rPr>
+              <w:t>$</w:t>
+            </w:r>
+          </w:p>
+        </w:tc>
+        <w:tc>
+          <w:tcPr>
+            <w:tcW w:w="1216" w:type="dxa"/>
+            <w:tcBorders>
+              <w:top w:val="nil"/>
+              <w:left w:val="nil"/>
+              <w:right w:val="nil"/>
+            </w:tcBorders>
+            <w:vAlign w:val="center"/>
+            <w:hideMark/>
+          </w:tcPr>
+          <w:p>
+            <w:pPr>
+              <w:tabs>
+                <w:tab w:val="decimal" w:pos="968"/>
+              </w:tabs>
+              <w:spacing w:after="0" w:line="240" w:lineRule="auto"/>
+              <w:rPr>
+                <w:rFonts w:ascii="Trebuchet MS" w:eastAsia="Times New Roman" w:hAnsi="Trebuchet MS" w:cs="Times New Roman"/>
+                <w:color w:val="000000"/>
+                <w:sz w:val="20"/>
+                <w:szCs w:val="20"/>
+                <w:lang w:val="es-419" w:eastAsia="es-419"/>
+              </w:rPr>
+            </w:pPr>
+            <w:r>
+              <w:rPr>
+                <w:rFonts w:ascii="Trebuchet MS" w:eastAsia="Times New Roman" w:hAnsi="Trebuchet MS" w:cs="Times New Roman"/>
+                <w:color w:val="000000"/>
+                <w:sz w:val="20"/>
+                <w:szCs w:val="20"/>
+                <w:lang w:val="es-419" w:eastAsia="es-419"/>
+              </w:rPr>
+              <w:t>(13,122)</w:t>
+            </w:r>
+          </w:p>
+        </w:tc>
+        <w:tc>
+          <w:tcPr>
+            <w:tcW w:w="245" w:type="dxa"/>
+            <w:tcBorders>
+              <w:top w:val="nil"/>
+              <w:left w:val="nil"/>
+              <w:right w:val="nil"/>
+            </w:tcBorders>
+            <w:vAlign w:val="center"/>
+            <w:hideMark/>
+          </w:tcPr>
+          <w:p>
+            <w:pPr>
+              <w:spacing w:after="0" w:line="240" w:lineRule="auto"/>
+              <w:rPr>
+                <w:rFonts w:ascii="Trebuchet MS" w:eastAsia="Times New Roman" w:hAnsi="Trebuchet MS" w:cs="Times New Roman"/>
+                <w:color w:val="000000"/>
+                <w:sz w:val="20"/>
+                <w:szCs w:val="20"/>
+                <w:lang w:val="es-419" w:eastAsia="es-419"/>
+              </w:rPr>
+            </w:pPr>
+            <w:r>
+              <w:rPr>
+                <w:rFonts w:ascii="Trebuchet MS" w:eastAsia="Times New Roman" w:hAnsi="Trebuchet MS" w:cs="Times New Roman"/>
+                <w:color w:val="000000"/>
+                <w:sz w:val="20"/>
+                <w:szCs w:val="20"/>
+                <w:lang w:val="es-419" w:eastAsia="es-419"/>
+              </w:rPr>
+              <w:t>$</w:t>
+            </w:r>
+          </w:p>
+        </w:tc>
+        <w:tc>
+          <w:tcPr>
+            <w:tcW w:w="1216" w:type="dxa"/>
+            <w:tcBorders>
+              <w:top w:val="nil"/>
+              <w:left w:val="nil"/>
+              <w:right w:val="nil"/>
+            </w:tcBorders>
+            <w:vAlign w:val="center"/>
+            <w:hideMark/>
+          </w:tcPr>
+          <w:p>
+            <w:pPr>
+              <w:tabs>
+                <w:tab w:val="decimal" w:pos="930"/>
+              </w:tabs>
+              <w:spacing w:after="0" w:line="240" w:lineRule="auto"/>
+              <w:rPr>
+                <w:rFonts w:ascii="Trebuchet MS" w:eastAsia="Times New Roman" w:hAnsi="Trebuchet MS" w:cs="Times New Roman"/>
+                <w:color w:val="000000"/>
+                <w:sz w:val="20"/>
+                <w:szCs w:val="20"/>
+                <w:lang w:val="es-419" w:eastAsia="es-419"/>
+              </w:rPr>
+            </w:pPr>
+            <w:r>
+              <w:rPr>
+                <w:rFonts w:ascii="Trebuchet MS" w:eastAsia="Times New Roman" w:hAnsi="Trebuchet MS" w:cs="Times New Roman"/>
+                <w:color w:val="000000"/>
+                <w:sz w:val="20"/>
+                <w:szCs w:val="20"/>
+                <w:lang w:val="es-419" w:eastAsia="es-419"/>
+              </w:rPr>
+              <w:t>(7,732)</w:t>
+            </w:r>
+          </w:p>
+        </w:tc>
+      </w:tr>
+    </w:tbl>
+    <w:p>
+      <w:pPr>
+        <w:spacing w:after="160" w:line="259" w:lineRule="auto"/>
+      </w:pPr>
+    </w:p>
+    <w:p>
+      <w:pPr>
+        <w:spacing w:after="160" w:line="259" w:lineRule="auto"/>
+      </w:pPr>
+    </w:p>
+    <w:p>
+      <w:pPr>
+        <w:spacing w:after="160" w:line="259" w:lineRule="auto"/>
+      </w:pPr>
+    </w:p>
+    <w:p>
+      <w:pPr>
+        <w:spacing w:after="160" w:line="259" w:lineRule="auto"/>
+      </w:pPr>
+    </w:p>
+    <w:p>
+      <w:pPr>
+        <w:spacing w:after="160" w:line="259" w:lineRule="auto"/>
+      </w:pPr>
+    </w:p>
+    <w:p>
+      <w:pPr>
+        <w:spacing w:after="160" w:line="259" w:lineRule="auto"/>
+      </w:pPr>
+    </w:p>
+    <w:p>
+      <w:pPr>
+        <w:spacing w:after="160" w:line="259" w:lineRule="auto"/>
+      </w:pPr>
+    </w:p>
+    <w:p>
+      <w:pPr>
+        <w:spacing w:after="160" w:line="259" w:lineRule="auto"/>
+      </w:pPr>
+    </w:p>
     <w:p>
       <w:pPr>
         <w:spacing w:after="160" w:line="259" w:lineRule="auto"/>

</xml_diff>